<commit_message>
Punto 2 y 5
Punto 2: Dilan
Punto 5: Yudi
</commit_message>
<xml_diff>
--- a/Investigación/InvestigaciónG1P5.docx
+++ b/Investigación/InvestigaciónG1P5.docx
@@ -89,7 +89,6 @@
     </w:p>
     <w:p>
       <w:pPr>
-        <w:spacing w:line="278" w:lineRule="auto"/>
         <w:ind w:firstLine="0"/>
       </w:pPr>
       <w:r>
@@ -100,7 +99,7 @@
       <w:pPr>
         <w:pStyle w:val="Ttulo1"/>
       </w:pPr>
-      <w:bookmarkStart w:id="0" w:name="_Toc225076151"/>
+      <w:bookmarkStart w:id="0" w:name="_Toc226283091"/>
       <w:r>
         <w:lastRenderedPageBreak/>
         <w:t>Índice</w:t>
@@ -131,7 +130,7 @@
             <w:rPr>
               <w:rFonts w:asciiTheme="minorHAnsi" w:eastAsiaTheme="minorEastAsia" w:hAnsiTheme="minorHAnsi"/>
               <w:noProof/>
-              <w:lang w:val="en-US"/>
+              <w:lang w:eastAsia="es-CR"/>
             </w:rPr>
           </w:pPr>
           <w:r>
@@ -143,7 +142,7 @@
           <w:r>
             <w:fldChar w:fldCharType="separate"/>
           </w:r>
-          <w:hyperlink w:anchor="_Toc225076151" w:history="1">
+          <w:hyperlink w:anchor="_Toc226283091" w:history="1">
             <w:r>
               <w:rPr>
                 <w:rStyle w:val="Hipervnculo"/>
@@ -170,7 +169,7 @@
                 <w:noProof/>
                 <w:webHidden/>
               </w:rPr>
-              <w:instrText xml:space="preserve"> PAGEREF _Toc225076151 \h </w:instrText>
+              <w:instrText xml:space="preserve"> PAGEREF _Toc226283091 \h </w:instrText>
             </w:r>
             <w:r>
               <w:rPr>
@@ -203,23 +202,23 @@
         </w:p>
         <w:p>
           <w:pPr>
-            <w:pStyle w:val="TDC1"/>
+            <w:pStyle w:val="TDC2"/>
             <w:tabs>
               <w:tab w:val="right" w:leader="dot" w:pos="9352"/>
             </w:tabs>
             <w:rPr>
               <w:rFonts w:asciiTheme="minorHAnsi" w:eastAsiaTheme="minorEastAsia" w:hAnsiTheme="minorHAnsi"/>
               <w:noProof/>
-              <w:lang w:val="en-US"/>
+              <w:lang w:eastAsia="es-CR"/>
             </w:rPr>
           </w:pPr>
-          <w:hyperlink w:anchor="_Toc225076152" w:history="1">
+          <w:hyperlink w:anchor="_Toc226283092" w:history="1">
             <w:r>
               <w:rPr>
                 <w:rStyle w:val="Hipervnculo"/>
                 <w:noProof/>
               </w:rPr>
-              <w:t>Desarrollo</w:t>
+              <w:t>Inteligencia artificial agentica</w:t>
             </w:r>
             <w:r>
               <w:rPr>
@@ -240,7 +239,7 @@
                 <w:noProof/>
                 <w:webHidden/>
               </w:rPr>
-              <w:instrText xml:space="preserve"> PAGEREF _Toc225076152 \h </w:instrText>
+              <w:instrText xml:space="preserve"> PAGEREF _Toc226283092 \h </w:instrText>
             </w:r>
             <w:r>
               <w:rPr>
@@ -280,16 +279,16 @@
             <w:rPr>
               <w:rFonts w:asciiTheme="minorHAnsi" w:eastAsiaTheme="minorEastAsia" w:hAnsiTheme="minorHAnsi"/>
               <w:noProof/>
-              <w:lang w:val="en-US"/>
+              <w:lang w:eastAsia="es-CR"/>
             </w:rPr>
           </w:pPr>
-          <w:hyperlink w:anchor="_Toc225076153" w:history="1">
+          <w:hyperlink w:anchor="_Toc226283093" w:history="1">
             <w:r>
               <w:rPr>
                 <w:rStyle w:val="Hipervnculo"/>
                 <w:noProof/>
               </w:rPr>
-              <w:t>Inteligencia artificial agéntica:</w:t>
+              <w:t>Comparación de herramientas de IA para codificación y despliegue</w:t>
             </w:r>
             <w:r>
               <w:rPr>
@@ -310,7 +309,7 @@
                 <w:noProof/>
                 <w:webHidden/>
               </w:rPr>
-              <w:instrText xml:space="preserve"> PAGEREF _Toc225076153 \h </w:instrText>
+              <w:instrText xml:space="preserve"> PAGEREF _Toc226283093 \h </w:instrText>
             </w:r>
             <w:r>
               <w:rPr>
@@ -330,7 +329,217 @@
                 <w:noProof/>
                 <w:webHidden/>
               </w:rPr>
-              <w:t>3</w:t>
+              <w:t>4</w:t>
+            </w:r>
+            <w:r>
+              <w:rPr>
+                <w:noProof/>
+                <w:webHidden/>
+              </w:rPr>
+              <w:fldChar w:fldCharType="end"/>
+            </w:r>
+          </w:hyperlink>
+        </w:p>
+        <w:p>
+          <w:pPr>
+            <w:pStyle w:val="TDC2"/>
+            <w:tabs>
+              <w:tab w:val="right" w:leader="dot" w:pos="9352"/>
+            </w:tabs>
+            <w:rPr>
+              <w:rFonts w:asciiTheme="minorHAnsi" w:eastAsiaTheme="minorEastAsia" w:hAnsiTheme="minorHAnsi"/>
+              <w:noProof/>
+              <w:lang w:eastAsia="es-CR"/>
+            </w:rPr>
+          </w:pPr>
+          <w:hyperlink w:anchor="_Toc226283094" w:history="1">
+            <w:r>
+              <w:rPr>
+                <w:rStyle w:val="Hipervnculo"/>
+                <w:noProof/>
+              </w:rPr>
+              <w:t>Impacto en la productividad y calidad</w:t>
+            </w:r>
+            <w:r>
+              <w:rPr>
+                <w:noProof/>
+                <w:webHidden/>
+              </w:rPr>
+              <w:tab/>
+            </w:r>
+            <w:r>
+              <w:rPr>
+                <w:noProof/>
+                <w:webHidden/>
+              </w:rPr>
+              <w:fldChar w:fldCharType="begin"/>
+            </w:r>
+            <w:r>
+              <w:rPr>
+                <w:noProof/>
+                <w:webHidden/>
+              </w:rPr>
+              <w:instrText xml:space="preserve"> PAGEREF _Toc226283094 \h </w:instrText>
+            </w:r>
+            <w:r>
+              <w:rPr>
+                <w:noProof/>
+                <w:webHidden/>
+              </w:rPr>
+            </w:r>
+            <w:r>
+              <w:rPr>
+                <w:noProof/>
+                <w:webHidden/>
+              </w:rPr>
+              <w:fldChar w:fldCharType="separate"/>
+            </w:r>
+            <w:r>
+              <w:rPr>
+                <w:noProof/>
+                <w:webHidden/>
+              </w:rPr>
+              <w:t>6</w:t>
+            </w:r>
+            <w:r>
+              <w:rPr>
+                <w:noProof/>
+                <w:webHidden/>
+              </w:rPr>
+              <w:fldChar w:fldCharType="end"/>
+            </w:r>
+          </w:hyperlink>
+        </w:p>
+        <w:p>
+          <w:pPr>
+            <w:pStyle w:val="TDC2"/>
+            <w:tabs>
+              <w:tab w:val="right" w:leader="dot" w:pos="9352"/>
+            </w:tabs>
+            <w:rPr>
+              <w:rFonts w:asciiTheme="minorHAnsi" w:eastAsiaTheme="minorEastAsia" w:hAnsiTheme="minorHAnsi"/>
+              <w:noProof/>
+              <w:lang w:eastAsia="es-CR"/>
+            </w:rPr>
+          </w:pPr>
+          <w:hyperlink w:anchor="_Toc226283095" w:history="1">
+            <w:r>
+              <w:rPr>
+                <w:rStyle w:val="Hipervnculo"/>
+                <w:noProof/>
+              </w:rPr>
+              <w:t>Ética y supervisión humana</w:t>
+            </w:r>
+            <w:r>
+              <w:rPr>
+                <w:noProof/>
+                <w:webHidden/>
+              </w:rPr>
+              <w:tab/>
+            </w:r>
+            <w:r>
+              <w:rPr>
+                <w:noProof/>
+                <w:webHidden/>
+              </w:rPr>
+              <w:fldChar w:fldCharType="begin"/>
+            </w:r>
+            <w:r>
+              <w:rPr>
+                <w:noProof/>
+                <w:webHidden/>
+              </w:rPr>
+              <w:instrText xml:space="preserve"> PAGEREF _Toc226283095 \h </w:instrText>
+            </w:r>
+            <w:r>
+              <w:rPr>
+                <w:noProof/>
+                <w:webHidden/>
+              </w:rPr>
+            </w:r>
+            <w:r>
+              <w:rPr>
+                <w:noProof/>
+                <w:webHidden/>
+              </w:rPr>
+              <w:fldChar w:fldCharType="separate"/>
+            </w:r>
+            <w:r>
+              <w:rPr>
+                <w:noProof/>
+                <w:webHidden/>
+              </w:rPr>
+              <w:t>6</w:t>
+            </w:r>
+            <w:r>
+              <w:rPr>
+                <w:noProof/>
+                <w:webHidden/>
+              </w:rPr>
+              <w:fldChar w:fldCharType="end"/>
+            </w:r>
+          </w:hyperlink>
+        </w:p>
+        <w:p>
+          <w:pPr>
+            <w:pStyle w:val="TDC2"/>
+            <w:tabs>
+              <w:tab w:val="right" w:leader="dot" w:pos="9352"/>
+            </w:tabs>
+            <w:rPr>
+              <w:rFonts w:asciiTheme="minorHAnsi" w:eastAsiaTheme="minorEastAsia" w:hAnsiTheme="minorHAnsi"/>
+              <w:noProof/>
+              <w:lang w:eastAsia="es-CR"/>
+            </w:rPr>
+          </w:pPr>
+          <w:hyperlink w:anchor="_Toc226283096" w:history="1">
+            <w:r>
+              <w:rPr>
+                <w:rStyle w:val="Hipervnculo"/>
+                <w:noProof/>
+              </w:rPr>
+              <w:t>Adopción de IA en el sector tecnológico de Costa Rica</w:t>
+            </w:r>
+            <w:r>
+              <w:rPr>
+                <w:noProof/>
+                <w:webHidden/>
+              </w:rPr>
+              <w:tab/>
+            </w:r>
+            <w:r>
+              <w:rPr>
+                <w:noProof/>
+                <w:webHidden/>
+              </w:rPr>
+              <w:fldChar w:fldCharType="begin"/>
+            </w:r>
+            <w:r>
+              <w:rPr>
+                <w:noProof/>
+                <w:webHidden/>
+              </w:rPr>
+              <w:instrText xml:space="preserve"> PAGEREF _Toc226283096 \h </w:instrText>
+            </w:r>
+            <w:r>
+              <w:rPr>
+                <w:noProof/>
+                <w:webHidden/>
+              </w:rPr>
+            </w:r>
+            <w:r>
+              <w:rPr>
+                <w:noProof/>
+                <w:webHidden/>
+              </w:rPr>
+              <w:fldChar w:fldCharType="separate"/>
+            </w:r>
+            <w:r>
+              <w:rPr>
+                <w:noProof/>
+                <w:webHidden/>
+              </w:rPr>
+              <w:t>6</w:t>
             </w:r>
             <w:r>
               <w:rPr>
@@ -350,10 +559,10 @@
             <w:rPr>
               <w:rFonts w:asciiTheme="minorHAnsi" w:eastAsiaTheme="minorEastAsia" w:hAnsiTheme="minorHAnsi"/>
               <w:noProof/>
-              <w:lang w:val="en-US"/>
+              <w:lang w:eastAsia="es-CR"/>
             </w:rPr>
           </w:pPr>
-          <w:hyperlink w:anchor="_Toc225076154" w:history="1">
+          <w:hyperlink w:anchor="_Toc226283097" w:history="1">
             <w:r>
               <w:rPr>
                 <w:rStyle w:val="Hipervnculo"/>
@@ -380,7 +589,7 @@
                 <w:noProof/>
                 <w:webHidden/>
               </w:rPr>
-              <w:instrText xml:space="preserve"> PAGEREF _Toc225076154 \h </w:instrText>
+              <w:instrText xml:space="preserve"> PAGEREF _Toc226283097 \h </w:instrText>
             </w:r>
             <w:r>
               <w:rPr>
@@ -400,7 +609,7 @@
                 <w:noProof/>
                 <w:webHidden/>
               </w:rPr>
-              <w:t>5</w:t>
+              <w:t>8</w:t>
             </w:r>
             <w:r>
               <w:rPr>
@@ -424,7 +633,6 @@
     </w:sdt>
     <w:p>
       <w:pPr>
-        <w:spacing w:line="278" w:lineRule="auto"/>
         <w:ind w:firstLine="0"/>
       </w:pPr>
       <w:r>
@@ -433,208 +641,983 @@
     </w:p>
     <w:p>
       <w:pPr>
-        <w:pStyle w:val="Ttulo1"/>
-      </w:pPr>
-      <w:bookmarkStart w:id="1" w:name="_Toc225076152"/>
+        <w:pStyle w:val="Ttulo2"/>
+      </w:pPr>
+      <w:bookmarkStart w:id="1" w:name="_Toc226283092"/>
       <w:r>
         <w:lastRenderedPageBreak/>
-        <w:t>Desarrollo</w:t>
+        <w:t xml:space="preserve">Inteligencia artificial </w:t>
+      </w:r>
+      <w:r>
+        <w:t>agentica</w:t>
       </w:r>
       <w:bookmarkEnd w:id="1"/>
     </w:p>
     <w:p>
+      <w:r>
+        <w:t>La inteligencia artificial agéntica se puede definir bajo tres características principales que la componen. Según Sapkota et al. (2025), estas son la autonomía, la especificidad de la tarea y la capacidad de reacción y adaptación. En primer lugar, la autonomía implica que durante los procesos gobernados por estas tecnologías el ser humano tenga poca o nula intervención, ya que una vez que el sistema es desplegado, este puede percibir su entorno, procesar información y ejecutar acciones por sí mismo en tiempo real. Esto permite que la IA agéntica sea altamente escalable y útil en contextos donde la supervisión constante no es viable.</w:t>
+      </w:r>
+    </w:p>
+    <w:p>
+      <w:r>
+        <w:t>Por otro lado, se destaca que estas soluciones son específicas a una tarea. Los autores explican que la IA agéntica está diseñada para desarrollar funciones concretas dentro de un dominio definido, como el filtrado de correos electrónicos, consultas a bases de datos o la gestión de calendarios. Esta especialización permite que los sistemas sean más eficientes, precisos y confiables en la ejecución de tareas repetitivas o bien estructuradas, evitando la necesidad de aplicar modelos de propósito general en escenarios donde no son necesarios.</w:t>
+      </w:r>
+    </w:p>
+    <w:p>
+      <w:r>
+        <w:t>Finalmente, la reactividad y adaptabilidad son características fundamentales. Sapkota et al. (2025) mencionan que estas herramientas deben incluir mecanismos que les permitan tomar decisiones a partir de inputs dinámicos, como solicitudes de usuarios o cambios en el entorno. Esto les permite responder en tiempo real y, en algunos casos, ajustar su comportamiento con base en retroalimentación o cambios en el contexto, lo que resulta especialmente útil en aplicaciones como sistemas de recomendación o asistentes conversacionales.</w:t>
+      </w:r>
+    </w:p>
+    <w:p>
+      <w:r>
+        <w:t xml:space="preserve">El desarrollo de estas herramientas ha sido fuertemente impulsado gracias al avance de los modelos de lenguaje grandes (LLMs) y los modelos de inferencia (LIMs). Según Sapkota et al. (2025), estas tecnologías funcionan como la base de las inteligencias artificiales </w:t>
+      </w:r>
+      <w:r>
+        <w:t>agenticas</w:t>
+      </w:r>
+      <w:r>
+        <w:t xml:space="preserve">, ya </w:t>
+      </w:r>
+      <w:r>
+        <w:lastRenderedPageBreak/>
+        <w:t>que actúan como los motores principales de razonamiento y percepción dentro de estos sistemas. Estas capacidades se pueden observar en herramientas como ChatGPT, que utiliza modelos como GPT-4, los cuales han sido entrenados con grandes volúmenes de datos textuales.</w:t>
+      </w:r>
+    </w:p>
+    <w:p>
+      <w:r>
+        <w:t>Gracias a su amplia capacidad en procesamiento de lenguaje natural (NLP), estos modelos pueden entender el lenguaje humano, interpretar contextos complejos y generar respuestas coherentes. Además, no solo se limitan a responder, sino que también pueden razonar, planificar y tomar decisiones dentro de un entorno determinado, lo que los convierte en un componente fundamental para el funcionamiento de los agentes inteligentes.</w:t>
+      </w:r>
+    </w:p>
+    <w:p>
       <w:pPr>
         <w:pStyle w:val="Ttulo2"/>
       </w:pPr>
-      <w:bookmarkStart w:id="2" w:name="_Toc225076153"/>
-      <w:r>
-        <w:t>Inteligencia artificial ag</w:t>
-      </w:r>
-      <w:r>
-        <w:t>é</w:t>
-      </w:r>
-      <w:r>
-        <w:t>ntica:</w:t>
+      <w:bookmarkStart w:id="2" w:name="_Toc226283093"/>
+      <w:r>
+        <w:t>Comparación</w:t>
+      </w:r>
+      <w:r>
+        <w:t xml:space="preserve"> de </w:t>
+      </w:r>
+      <w:r>
+        <w:t>h</w:t>
+      </w:r>
+      <w:r>
+        <w:t xml:space="preserve">erramientas de IA </w:t>
+      </w:r>
+      <w:r>
+        <w:t>para codificación y despliegue</w:t>
       </w:r>
       <w:bookmarkEnd w:id="2"/>
     </w:p>
     <w:p>
       <w:r>
-        <w:t>La inteligencia artificial agéntica se puede definir bajo tres características principales que la componen. Según Sapkota et al. (2025), estas son la autonomía, la especificidad de la tarea y la capacidad de reacción y adaptación. En primer lugar, la autonomía implica que durante los procesos gobernados por estas tecnologías el ser humano tenga poca o nula intervención, ya que una vez que el sistema es desplegado, este puede percibir su entorno, procesar información y ejecutar acciones por sí mismo en tiempo real. Esto permite que la IA agéntica sea altamente escalable y útil en contextos donde la supervisión constante no es viable.</w:t>
+        <w:t xml:space="preserve">En la inteligencia artificial agentica existen muchas herramientas que automatizan procesos como la escritura de código, pruebas, integración continua y despliegue. Entre las más relevantes se encuentran GitHub </w:t>
+      </w:r>
+      <w:proofErr w:type="spellStart"/>
+      <w:r>
+        <w:t>Copilot</w:t>
+      </w:r>
+      <w:proofErr w:type="spellEnd"/>
+      <w:r>
+        <w:t>, Devin AI y los agentes de infraestructura (</w:t>
+      </w:r>
+      <w:proofErr w:type="spellStart"/>
+      <w:r>
+        <w:t>IaC</w:t>
+      </w:r>
+      <w:proofErr w:type="spellEnd"/>
+      <w:r>
+        <w:t>), los cuales presentan diferencias importantes en términos de autonomía, alcance y aplicación.</w:t>
       </w:r>
     </w:p>
     <w:p>
       <w:r>
-        <w:t>Por otro lado, se destaca que estas soluciones son específicas a una tarea. Los autores explican que la IA agéntica está diseñada para desarrollar funciones concretas dentro de un dominio definido, como el filtrado de correos electrónicos, consultas a bases de datos o la gestión de calendarios. Esta especialización permite que los sistemas sean más eficientes, precisos y confiables en la ejecución de tareas repetitivas o bien estructuradas, evitando la necesidad de aplicar modelos de propósito general en escenarios donde no son necesarios.</w:t>
+        <w:t xml:space="preserve">GitHub </w:t>
+      </w:r>
+      <w:proofErr w:type="spellStart"/>
+      <w:r>
+        <w:t>Copilot</w:t>
+      </w:r>
+      <w:proofErr w:type="spellEnd"/>
+      <w:r>
+        <w:t>: Asistencia aumentada para desarrolladores</w:t>
       </w:r>
     </w:p>
     <w:p>
       <w:r>
-        <w:t>Finalmente, la reactividad y adaptabilidad son características fundamentales. Sapkota et al. (2025) mencionan que estas herramientas deben incluir mecanismos que les permitan tomar decisiones a partir de inputs dinámicos, como solicitudes de usuarios o cambios en el entorno. Esto les permite responder en tiempo real y, en algunos casos, ajustar su comportamiento con base en retroalimentación o cambios en el contexto, lo que resulta especialmente útil en aplicaciones como sistemas de recomendación o asistentes conversacionales.</w:t>
+        <w:t xml:space="preserve">GitHub </w:t>
+      </w:r>
+      <w:proofErr w:type="spellStart"/>
+      <w:r>
+        <w:t>Copilot</w:t>
+      </w:r>
+      <w:proofErr w:type="spellEnd"/>
+      <w:r>
+        <w:t xml:space="preserve"> es una herramienta de asistencia desarrollada por GitHub en colaboración con </w:t>
+      </w:r>
+      <w:proofErr w:type="spellStart"/>
+      <w:r>
+        <w:t>OpenAI</w:t>
+      </w:r>
+      <w:proofErr w:type="spellEnd"/>
+      <w:r>
+        <w:t xml:space="preserve">. Su principal función es sugerir partes de código conforme se va escribiendo dentro del entorno de desarrollo (IDE), apoyando al programador durante la escritura y programación </w:t>
+      </w:r>
+      <w:r>
+        <w:t>de este</w:t>
+      </w:r>
+      <w:r>
+        <w:t>.</w:t>
       </w:r>
     </w:p>
     <w:p>
-      <w:pPr>
-        <w:ind w:firstLine="0"/>
-      </w:pPr>
+      <w:proofErr w:type="spellStart"/>
+      <w:r>
+        <w:t>Copilot</w:t>
+      </w:r>
+      <w:proofErr w:type="spellEnd"/>
+      <w:r>
+        <w:t xml:space="preserve"> analiza el código y el contexto </w:t>
+      </w:r>
+      <w:proofErr w:type="gramStart"/>
+      <w:r>
+        <w:t>del mismo</w:t>
+      </w:r>
+      <w:proofErr w:type="gramEnd"/>
+      <w:r>
+        <w:t xml:space="preserve"> para poder generar sugerencias que puedan hacer más rápido el desarrollo, reducir errores de sintaxis y mejorar la productividad. Sin embargo, no ejecuta tareas de forma autónoma ni toma decisiones.</w:t>
+      </w:r>
     </w:p>
     <w:p>
       <w:r>
-        <w:lastRenderedPageBreak/>
-        <w:tab/>
-      </w:r>
-      <w:r>
-        <w:t>El desarrollo de estas herramientas ha sido fuertemente impulsado gracias al avance de los modelos de lenguaje grandes (</w:t>
-      </w:r>
-      <w:proofErr w:type="spellStart"/>
-      <w:r>
-        <w:t>LLMs</w:t>
-      </w:r>
-      <w:proofErr w:type="spellEnd"/>
-      <w:r>
-        <w:t>) y los modelos de inferencia (</w:t>
-      </w:r>
-      <w:proofErr w:type="spellStart"/>
-      <w:r>
-        <w:t>LIMs</w:t>
-      </w:r>
-      <w:proofErr w:type="spellEnd"/>
-      <w:r>
-        <w:t xml:space="preserve">). Según Sapkota et al. (2025), estas tecnologías funcionan como la base de las inteligencias artificiales </w:t>
-      </w:r>
-      <w:proofErr w:type="spellStart"/>
-      <w:r>
-        <w:t>agénticas</w:t>
-      </w:r>
-      <w:proofErr w:type="spellEnd"/>
-      <w:r>
-        <w:t xml:space="preserve">, ya que actúan como los motores principales de razonamiento y percepción dentro de estos sistemas. Estas capacidades se pueden observar en herramientas como </w:t>
-      </w:r>
-      <w:proofErr w:type="spellStart"/>
-      <w:r>
-        <w:t>ChatGPT</w:t>
-      </w:r>
-      <w:proofErr w:type="spellEnd"/>
-      <w:r>
-        <w:t>, que utiliza modelos como GPT-4, los cuales han sido entrenados con grandes volúmenes de datos textuales.</w:t>
+        <w:t>Devin AI: Hacia el desarrollo autónomo de software</w:t>
       </w:r>
     </w:p>
     <w:p>
       <w:r>
-        <w:t>Gracias a su amplia capacidad en procesamiento de lenguaje natural (NLP), estos modelos pueden entender el lenguaje humano, interpretar contextos complejos y generar respuestas coherentes. Además, no solo se limitan a responder, sino que también pueden razonar, planificar y tomar decisiones dentro de un entorno determinado, lo que los convierte en un componente fundamental para el funcionamiento de los agentes inteligentes.</w:t>
-      </w:r>
-    </w:p>
-    <w:p/>
-    <w:p>
-      <w:pPr>
-        <w:spacing w:line="278" w:lineRule="auto"/>
-        <w:ind w:firstLine="0"/>
-      </w:pPr>
-      <w:r>
-        <w:br w:type="page"/>
+        <w:lastRenderedPageBreak/>
+        <w:t xml:space="preserve">Por otro lado, Devin AI desarrollado por </w:t>
+      </w:r>
+      <w:proofErr w:type="spellStart"/>
+      <w:r>
+        <w:t>Cognition</w:t>
+      </w:r>
+      <w:proofErr w:type="spellEnd"/>
+      <w:r>
+        <w:t xml:space="preserve"> Labs, es presentado como un ingeniero de software AI, capaz de planificar, escribir, probar y depurar código de forma independiente.</w:t>
       </w:r>
     </w:p>
     <w:p>
-      <w:pPr>
-        <w:pStyle w:val="Ttulo1"/>
-      </w:pPr>
-      <w:bookmarkStart w:id="3" w:name="_Toc225076154"/>
+      <w:r>
+        <w:t xml:space="preserve">A diferencia de </w:t>
+      </w:r>
+      <w:proofErr w:type="spellStart"/>
+      <w:r>
+        <w:t>Copilot</w:t>
+      </w:r>
+      <w:proofErr w:type="spellEnd"/>
+      <w:r>
+        <w:t>, Devin no solo sugiere código, sino que puede ejecutar tareas completas como:</w:t>
+      </w:r>
+    </w:p>
+    <w:p>
+      <w:pPr>
+        <w:numPr>
+          <w:ilvl w:val="0"/>
+          <w:numId w:val="31"/>
+        </w:numPr>
+      </w:pPr>
+      <w:r>
+        <w:t>Crear aplicaciones desde cero</w:t>
+      </w:r>
+    </w:p>
+    <w:p>
+      <w:pPr>
+        <w:numPr>
+          <w:ilvl w:val="0"/>
+          <w:numId w:val="31"/>
+        </w:numPr>
+      </w:pPr>
+      <w:r>
+        <w:t>Resolver errores de código</w:t>
+      </w:r>
+    </w:p>
+    <w:p>
+      <w:pPr>
+        <w:numPr>
+          <w:ilvl w:val="0"/>
+          <w:numId w:val="31"/>
+        </w:numPr>
+      </w:pPr>
+      <w:r>
+        <w:t>Ejecutar pruebas automatizadas</w:t>
+      </w:r>
+    </w:p>
+    <w:p>
+      <w:pPr>
+        <w:numPr>
+          <w:ilvl w:val="0"/>
+          <w:numId w:val="31"/>
+        </w:numPr>
+      </w:pPr>
+      <w:r>
+        <w:t>Gestionar repositorios</w:t>
+      </w:r>
+    </w:p>
+    <w:p>
+      <w:r>
+        <w:t>Esto lo convierte en un ejemplo de IA agentica, ya que tiene autonomía, razonamiento y adaptación en un mismo sistema. Su uso aún está en etapas tempranas por lo que necesita supervisión para garantizar su confiabilidad.</w:t>
+      </w:r>
+    </w:p>
+    <w:p>
+      <w:r>
+        <w:t>Agentes de Infraestructura (</w:t>
+      </w:r>
+      <w:proofErr w:type="spellStart"/>
+      <w:r>
+        <w:t>IaC</w:t>
+      </w:r>
+      <w:proofErr w:type="spellEnd"/>
+      <w:r>
+        <w:t>): Automatización del despliegue</w:t>
+      </w:r>
+    </w:p>
+    <w:p>
+      <w:r>
+        <w:t xml:space="preserve">Herramientas como </w:t>
+      </w:r>
+      <w:proofErr w:type="spellStart"/>
+      <w:r>
+        <w:t>Terraform</w:t>
+      </w:r>
+      <w:proofErr w:type="spellEnd"/>
+      <w:r>
+        <w:t xml:space="preserve"> o AWS </w:t>
+      </w:r>
+      <w:proofErr w:type="spellStart"/>
+      <w:r>
+        <w:t>CloudFormation</w:t>
+      </w:r>
+      <w:proofErr w:type="spellEnd"/>
+      <w:r>
+        <w:t xml:space="preserve"> permiten definir, configurar y desplegar infraestructura mediante código, esto representan otra dimensión clave dentro de la automatización.</w:t>
+      </w:r>
+    </w:p>
+    <w:p>
+      <w:r>
+        <w:t>Cuando se integran con inteligencia artificial, estos sistemas evolucionan hacia agentes capaces de:</w:t>
+      </w:r>
+    </w:p>
+    <w:p>
+      <w:pPr>
+        <w:numPr>
+          <w:ilvl w:val="0"/>
+          <w:numId w:val="32"/>
+        </w:numPr>
+      </w:pPr>
+      <w:r>
+        <w:t>Aprovisionar recursos automáticamente</w:t>
+      </w:r>
+    </w:p>
+    <w:p>
+      <w:pPr>
+        <w:numPr>
+          <w:ilvl w:val="0"/>
+          <w:numId w:val="32"/>
+        </w:numPr>
+      </w:pPr>
+      <w:r>
+        <w:t>Detectar fallos en configuraciones</w:t>
+      </w:r>
+    </w:p>
+    <w:p>
+      <w:pPr>
+        <w:numPr>
+          <w:ilvl w:val="0"/>
+          <w:numId w:val="32"/>
+        </w:numPr>
+      </w:pPr>
       <w:r>
         <w:lastRenderedPageBreak/>
-        <w:t>Referencias</w:t>
+        <w:t>Optimizar costos y rendimiento</w:t>
+      </w:r>
+    </w:p>
+    <w:p>
+      <w:pPr>
+        <w:numPr>
+          <w:ilvl w:val="0"/>
+          <w:numId w:val="32"/>
+        </w:numPr>
+      </w:pPr>
+      <w:r>
+        <w:t>Ajustar la infraestructura según la demanda</w:t>
+      </w:r>
+    </w:p>
+    <w:p>
+      <w:r>
+        <w:t xml:space="preserve">A diferencia de </w:t>
+      </w:r>
+      <w:proofErr w:type="spellStart"/>
+      <w:r>
+        <w:t>Copilot</w:t>
+      </w:r>
+      <w:proofErr w:type="spellEnd"/>
+      <w:r>
+        <w:t xml:space="preserve"> y Devin, estos agentes se enfocan en la fase de despliegue y operación, siendo fundamentales en entornos DevOps.</w:t>
+      </w:r>
+    </w:p>
+    <w:p>
+      <w:pPr>
+        <w:pStyle w:val="Ttulo2"/>
+      </w:pPr>
+      <w:bookmarkStart w:id="3" w:name="_Toc226283094"/>
+      <w:r>
+        <w:t>Impacto en la productiv</w:t>
+      </w:r>
+      <w:r>
+        <w:t>idad y calidad</w:t>
       </w:r>
       <w:bookmarkEnd w:id="3"/>
     </w:p>
     <w:p>
       <w:pPr>
-        <w:ind w:left="720" w:hanging="720"/>
-      </w:pPr>
-      <w:r>
-        <w:t xml:space="preserve">Sapkota, R., Roumeliotis, K. I., &amp; </w:t>
+        <w:pStyle w:val="Ttulo2"/>
+      </w:pPr>
+      <w:bookmarkStart w:id="4" w:name="_Toc226283095"/>
+      <w:r>
+        <w:t>Ética y supervisión humana</w:t>
+      </w:r>
+      <w:bookmarkEnd w:id="4"/>
+    </w:p>
+    <w:p>
+      <w:pPr>
+        <w:pStyle w:val="Ttulo2"/>
+      </w:pPr>
+      <w:bookmarkStart w:id="5" w:name="_Toc226283096"/>
+      <w:r>
+        <w:t xml:space="preserve">Adopción de IA en el </w:t>
+      </w:r>
+      <w:r>
+        <w:t>s</w:t>
+      </w:r>
+      <w:r>
+        <w:t xml:space="preserve">ector </w:t>
+      </w:r>
+      <w:r>
+        <w:t>t</w:t>
+      </w:r>
+      <w:r>
+        <w:t>ecnológico de Costa Rica</w:t>
+      </w:r>
+      <w:bookmarkEnd w:id="5"/>
+    </w:p>
+    <w:p>
+      <w:r>
+        <w:t xml:space="preserve">En Costa Rica, la </w:t>
+      </w:r>
+      <w:r>
+        <w:t>implementación</w:t>
+      </w:r>
+      <w:r>
+        <w:t xml:space="preserve"> de la inteligencia artificial ha ido evolucionando hacia soluciones cada vez más avanzadas, especialmente con la incorporación de </w:t>
+      </w:r>
+      <w:r>
+        <w:t xml:space="preserve">la </w:t>
+      </w:r>
+      <w:r>
+        <w:t xml:space="preserve">IA agentica. </w:t>
+      </w:r>
+    </w:p>
+    <w:p>
+      <w:r>
+        <w:t>Un ejemplo es el sistema MAIA, desarrollado por Grupo BG&amp;A, que automatiza la atención al cliente mediante respuestas inmediatas y ejecución de acciones al instante. Esto permite reducir significativamente los tiempos de servicio y mejorar la experiencia del usuario.</w:t>
+      </w:r>
+    </w:p>
+    <w:p>
+      <w:r>
+        <w:t xml:space="preserve">Innova Marketing Solutions ha implementado agentes inteligentes que automatizan procesos comerciales como la calificación de clientes, el agendamiento de citas y el seguimiento de </w:t>
+      </w:r>
+      <w:r>
+        <w:t>clientes potenciales</w:t>
+      </w:r>
+      <w:r>
+        <w:t xml:space="preserve">. Gracias a esto, las empresas pueden cerrar ventas en menos tiempo y agilizar todo el ciclo comercial. </w:t>
+      </w:r>
+      <w:r>
+        <w:t>Así mismo</w:t>
+      </w:r>
+      <w:r>
+        <w:t>, Mintive Studio desarrolla soluciones que optimizan tanto las ventas como la atención al cliente, haciendo que las operaciones sean más rápidas y eficientes.</w:t>
+      </w:r>
+    </w:p>
+    <w:p>
+      <w:r>
+        <w:t xml:space="preserve">Por otro lado, empresas como Datasys Group y Aplix han </w:t>
+      </w:r>
+      <w:r>
+        <w:t>implementado</w:t>
+      </w:r>
+      <w:r>
+        <w:t xml:space="preserve"> inteligencia artificial en sistemas empresariales como ERP y CRM. Esto les permite automatizar flujos de trabajo y eliminar tiempos muertos dentro de las organizaciones, logrando procesos más ágiles y una entrega más rápida de productos y servicios.</w:t>
+      </w:r>
+    </w:p>
+    <w:p>
+      <w:r>
+        <w:lastRenderedPageBreak/>
+        <w:t>Además, la inteligencia artificial también está presente en sectores más tradicionales. En el comercio, compañías como Grupo Monge y Walmart la utilizan para predecir la demanda, optimizar inventarios y automatizar decisiones logísticas. Esto se traduce en una mejor disponibilidad de productos y en menores tiempos de reposición.</w:t>
+      </w:r>
+    </w:p>
+    <w:p>
+      <w:r>
+        <w:t>En el sector financiero, instituciones como BAC Credomatic y el Banco Nacional de Costa Rica emplean IA para agilizar la atención al cliente y automatizar procesos internos, reduciendo notablemente los tiempos de respuesta en sus servicios.</w:t>
+      </w:r>
+    </w:p>
+    <w:p>
+      <w:r>
+        <w:t>Finalmente, en el ámbito logístico, Correos de Costa Rica ha incorporado inteligencia artificial y Big Data para optimizar sus operaciones. Según la propia institución, estas herramientas permiten realizar pronósticos más precisos, anticiparse a las necesidades de los clientes y mejorar su competitividad en el mercado.</w:t>
+      </w:r>
+    </w:p>
+    <w:p>
+      <w:pPr>
+        <w:ind w:firstLine="0"/>
+      </w:pPr>
+      <w:r>
+        <w:br w:type="page"/>
+      </w:r>
+    </w:p>
+    <w:p>
+      <w:pPr>
+        <w:pStyle w:val="Ttulo1"/>
+      </w:pPr>
+      <w:bookmarkStart w:id="6" w:name="_Toc226283097"/>
+      <w:r>
+        <w:lastRenderedPageBreak/>
+        <w:t>Referencias</w:t>
+      </w:r>
+      <w:bookmarkEnd w:id="6"/>
+    </w:p>
+    <w:p>
+      <w:pPr>
+        <w:ind w:left="709" w:hanging="709"/>
+        <w:rPr>
+          <w:i/>
+          <w:iCs/>
+        </w:rPr>
+      </w:pPr>
+      <w:r>
+        <w:t>Aplix. (s.f.).</w:t>
+      </w:r>
+      <w:r>
+        <w:rPr>
+          <w:i/>
+          <w:iCs/>
+        </w:rPr>
+        <w:t xml:space="preserve"> Inteligencia artificial aplicada a procesos empresariales. </w:t>
+      </w:r>
+      <w:hyperlink r:id="rId11" w:tgtFrame="_blank" w:history="1">
+        <w:r>
+          <w:rPr>
+            <w:rStyle w:val="Hipervnculo"/>
+            <w:i/>
+            <w:iCs/>
+          </w:rPr>
+          <w:t>https://aplix.cr/servicios/inteligencia-artificial-aplicada-a-procesos-empresariales/</w:t>
+        </w:r>
+      </w:hyperlink>
+    </w:p>
+    <w:p>
+      <w:pPr>
+        <w:ind w:left="709" w:hanging="709"/>
+        <w:rPr>
+          <w:lang w:val="en-US"/>
+        </w:rPr>
+      </w:pPr>
+      <w:r>
+        <w:rPr>
+          <w:lang w:val="en-US"/>
+        </w:rPr>
+        <w:t>C</w:t>
+      </w:r>
+      <w:r>
+        <w:rPr>
+          <w:lang w:val="en-US"/>
+        </w:rPr>
+        <w:t xml:space="preserve"> </w:t>
+      </w:r>
+      <w:r>
+        <w:rPr>
+          <w:lang w:val="en-US"/>
+        </w:rPr>
+        <w:t>Mao, L. (2025, February 11). </w:t>
+      </w:r>
+      <w:r>
+        <w:rPr>
+          <w:i/>
+          <w:iCs/>
+          <w:lang w:val="en-US"/>
+        </w:rPr>
+        <w:t>Evaluating LLMs for infrastructure as code</w:t>
+      </w:r>
+      <w:r>
+        <w:rPr>
+          <w:lang w:val="en-US"/>
+        </w:rPr>
+        <w:t xml:space="preserve">. Medium. </w:t>
+      </w:r>
+      <w:hyperlink r:id="rId12" w:tgtFrame="_blank" w:tooltip="https://medium.com/gft-engineering/evaluating-llms-for-infrastructure-as-code-9f8b9ac4ca33" w:history="1">
+        <w:r>
+          <w:rPr>
+            <w:rStyle w:val="Hipervnculo"/>
+            <w:lang w:val="en-US"/>
+          </w:rPr>
+          <w:t>https://medium.com/gft-engineering/evaluating-llms-for-infrastructure-as-code-9f8b9ac4ca33</w:t>
+        </w:r>
+      </w:hyperlink>
+    </w:p>
+    <w:p>
+      <w:pPr>
+        <w:ind w:left="709" w:hanging="709"/>
+        <w:rPr>
+          <w:i/>
+          <w:iCs/>
+        </w:rPr>
+      </w:pPr>
+      <w:r>
+        <w:t>Datasys. (7 de enero de 2026).</w:t>
+      </w:r>
+      <w:r>
+        <w:rPr>
+          <w:i/>
+          <w:iCs/>
+        </w:rPr>
+        <w:t xml:space="preserve"> Servicios. </w:t>
+      </w:r>
+      <w:hyperlink r:id="rId13" w:tgtFrame="_blank" w:history="1">
+        <w:r>
+          <w:rPr>
+            <w:rStyle w:val="Hipervnculo"/>
+            <w:i/>
+            <w:iCs/>
+          </w:rPr>
+          <w:t>https://datasys.la/servicios/</w:t>
+        </w:r>
+      </w:hyperlink>
+    </w:p>
+    <w:p>
+      <w:pPr>
+        <w:ind w:left="709" w:hanging="709"/>
+        <w:rPr>
+          <w:lang w:val="en-US"/>
+        </w:rPr>
+      </w:pPr>
+      <w:r>
+        <w:rPr>
+          <w:lang w:val="en-US"/>
+        </w:rPr>
+        <w:t>Devin. (</w:t>
+      </w:r>
+      <w:r>
+        <w:rPr>
+          <w:lang w:val="en-US"/>
+        </w:rPr>
+        <w:t>s</w:t>
+      </w:r>
+      <w:r>
+        <w:rPr>
+          <w:lang w:val="en-US"/>
+        </w:rPr>
+        <w:t>.</w:t>
+      </w:r>
+      <w:r>
+        <w:rPr>
+          <w:lang w:val="en-US"/>
+        </w:rPr>
+        <w:t>f</w:t>
+      </w:r>
+      <w:r>
+        <w:rPr>
+          <w:lang w:val="en-US"/>
+        </w:rPr>
+        <w:t>.)</w:t>
+      </w:r>
+      <w:r>
+        <w:rPr>
+          <w:i/>
+          <w:iCs/>
+          <w:lang w:val="en-US"/>
+        </w:rPr>
+        <w:t xml:space="preserve">. </w:t>
       </w:r>
       <w:proofErr w:type="spellStart"/>
       <w:r>
-        <w:t>Karkee</w:t>
+        <w:rPr>
+          <w:i/>
+          <w:iCs/>
+          <w:lang w:val="en-US"/>
+        </w:rPr>
+        <w:t>Devin.Ai</w:t>
       </w:r>
       <w:proofErr w:type="spellEnd"/>
-      <w:r>
-        <w:t xml:space="preserve">, M. (2025). </w:t>
+      <w:proofErr w:type="gramStart"/>
+      <w:r>
+        <w:rPr>
+          <w:i/>
+          <w:iCs/>
+          <w:lang w:val="en-US"/>
+        </w:rPr>
+        <w:t xml:space="preserve">. </w:t>
+      </w:r>
+      <w:r>
+        <w:rPr>
+          <w:i/>
+          <w:iCs/>
+          <w:lang w:val="en-US"/>
+        </w:rPr>
+        <w:t xml:space="preserve"> </w:t>
+      </w:r>
+      <w:proofErr w:type="gramEnd"/>
+      <w:r>
+        <w:fldChar w:fldCharType="begin"/>
+      </w:r>
+      <w:r>
+        <w:rPr>
+          <w:lang w:val="en-US"/>
+        </w:rPr>
+        <w:instrText>HYPERLINK "https://devin.ai/" \o "https://devin.ai/" \t "_blank"</w:instrText>
+      </w:r>
+      <w:r>
+        <w:fldChar w:fldCharType="separate"/>
+      </w:r>
+      <w:r>
+        <w:rPr>
+          <w:rStyle w:val="Hipervnculo"/>
+          <w:i/>
+          <w:iCs/>
+          <w:lang w:val="en-US"/>
+        </w:rPr>
+        <w:t>https://devin.ai/</w:t>
+      </w:r>
+      <w:r>
+        <w:fldChar w:fldCharType="end"/>
+      </w:r>
+      <w:r>
+        <w:rPr>
+          <w:i/>
+          <w:iCs/>
+          <w:lang w:val="en-US"/>
+        </w:rPr>
+        <w:t> </w:t>
+      </w:r>
+    </w:p>
+    <w:p>
+      <w:pPr>
+        <w:ind w:left="709" w:hanging="709"/>
+      </w:pPr>
+      <w:r>
+        <w:t>Git</w:t>
+      </w:r>
+      <w:r>
+        <w:t>H</w:t>
+      </w:r>
+      <w:r>
+        <w:t>ub</w:t>
+      </w:r>
+      <w:r>
+        <w:t>. (s.f.)</w:t>
+      </w:r>
+      <w:r>
+        <w:rPr>
+          <w:i/>
+          <w:iCs/>
+        </w:rPr>
+        <w:t xml:space="preserve"> </w:t>
+      </w:r>
+      <w:r>
+        <w:rPr>
+          <w:i/>
+          <w:iCs/>
+        </w:rPr>
+        <w:t xml:space="preserve">GitHub </w:t>
       </w:r>
       <w:proofErr w:type="spellStart"/>
       <w:r>
-        <w:t>Ai</w:t>
+        <w:rPr>
+          <w:i/>
+          <w:iCs/>
+        </w:rPr>
+        <w:t>Copilot</w:t>
       </w:r>
       <w:proofErr w:type="spellEnd"/>
       <w:r>
+        <w:rPr>
+          <w:i/>
+          <w:iCs/>
+        </w:rPr>
+        <w:t>: tu programador de pareja de IA. (2026).</w:t>
+      </w:r>
+      <w:r>
+        <w:rPr>
+          <w:i/>
+          <w:iCs/>
+        </w:rPr>
         <w:t xml:space="preserve"> </w:t>
       </w:r>
+      <w:hyperlink r:id="rId14" w:history="1">
+        <w:r>
+          <w:rPr>
+            <w:rStyle w:val="Hipervnculo"/>
+            <w:i/>
+            <w:iCs/>
+          </w:rPr>
+          <w:t>https://github.com/features/copilot?locale=es-419</w:t>
+        </w:r>
+      </w:hyperlink>
+    </w:p>
+    <w:p>
+      <w:pPr>
+        <w:ind w:left="709" w:hanging="709"/>
+        <w:rPr>
+          <w:i/>
+          <w:iCs/>
+        </w:rPr>
+      </w:pPr>
+      <w:r>
+        <w:t>González, C. (20 de marzo de 2025).</w:t>
+      </w:r>
+      <w:r>
+        <w:rPr>
+          <w:i/>
+          <w:iCs/>
+        </w:rPr>
+        <w:t xml:space="preserve"> Innovaciones en logística: En ruta a la automatización. Correos de Costa Rica. </w:t>
+      </w:r>
+      <w:hyperlink r:id="rId15" w:tgtFrame="_blank" w:history="1">
+        <w:r>
+          <w:rPr>
+            <w:rStyle w:val="Hipervnculo"/>
+            <w:i/>
+            <w:iCs/>
+          </w:rPr>
+          <w:t>https://correos.go.cr/transformando-la-logistica/</w:t>
+        </w:r>
+      </w:hyperlink>
+    </w:p>
+    <w:p>
+      <w:pPr>
+        <w:ind w:left="709" w:hanging="709"/>
+        <w:rPr>
+          <w:b/>
+          <w:bCs/>
+          <w:i/>
+          <w:iCs/>
+        </w:rPr>
+      </w:pPr>
+      <w:r>
+        <w:t>Grupo BG&amp;A</w:t>
+      </w:r>
+      <w:r>
+        <w:t>. (16 de octubre de 2018).</w:t>
+      </w:r>
+      <w:r>
+        <w:rPr>
+          <w:i/>
+          <w:iCs/>
+        </w:rPr>
+        <w:t xml:space="preserve"> MAIA Sistema de Inteligencia Artificial en Costa Rica. </w:t>
+      </w:r>
+      <w:hyperlink r:id="rId16" w:tgtFrame="_blank" w:history="1">
+        <w:r>
+          <w:rPr>
+            <w:rStyle w:val="Hipervnculo"/>
+            <w:i/>
+            <w:iCs/>
+          </w:rPr>
+          <w:t>https://callmaia.co</w:t>
+        </w:r>
+        <w:r>
+          <w:rPr>
+            <w:rStyle w:val="Hipervnculo"/>
+            <w:i/>
+            <w:iCs/>
+          </w:rPr>
+          <w:t>m</w:t>
+        </w:r>
+        <w:r>
+          <w:rPr>
+            <w:rStyle w:val="Hipervnculo"/>
+            <w:i/>
+            <w:iCs/>
+          </w:rPr>
+          <w:t>/quienes-somos/</w:t>
+        </w:r>
+      </w:hyperlink>
+    </w:p>
+    <w:p>
+      <w:pPr>
+        <w:ind w:left="709" w:hanging="709"/>
+        <w:rPr>
+          <w:i/>
+          <w:iCs/>
+          <w:lang w:val="en-US"/>
+        </w:rPr>
+      </w:pPr>
+      <w:r>
+        <w:rPr>
+          <w:lang w:val="en-US"/>
+        </w:rPr>
+        <w:t>Innova-MS. (s.f.).</w:t>
+      </w:r>
+      <w:r>
+        <w:rPr>
+          <w:i/>
+          <w:iCs/>
+          <w:lang w:val="en-US"/>
+        </w:rPr>
+        <w:t xml:space="preserve"> AI service agents. </w:t>
+      </w:r>
+      <w:hyperlink r:id="rId17" w:tgtFrame="_blank" w:history="1">
+        <w:r>
+          <w:rPr>
+            <w:rStyle w:val="Hipervnculo"/>
+            <w:i/>
+            <w:iCs/>
+            <w:lang w:val="en-US"/>
+          </w:rPr>
+          <w:t>https://innova-ms.com/ai-service-agents/</w:t>
+        </w:r>
+      </w:hyperlink>
+    </w:p>
+    <w:p>
+      <w:pPr>
+        <w:ind w:left="709" w:hanging="709"/>
+        <w:rPr>
+          <w:i/>
+          <w:iCs/>
+          <w:lang w:val="en-US"/>
+        </w:rPr>
+      </w:pPr>
+      <w:r>
+        <w:rPr>
+          <w:lang w:val="en-US"/>
+        </w:rPr>
+        <w:t>Mintive Studio. (s.f.).</w:t>
+      </w:r>
+      <w:r>
+        <w:rPr>
+          <w:i/>
+          <w:iCs/>
+          <w:lang w:val="en-US"/>
+        </w:rPr>
+        <w:t xml:space="preserve"> Mintive Studio. </w:t>
+      </w:r>
+      <w:hyperlink r:id="rId18" w:tgtFrame="_blank" w:history="1">
+        <w:r>
+          <w:rPr>
+            <w:rStyle w:val="Hipervnculo"/>
+            <w:i/>
+            <w:iCs/>
+            <w:lang w:val="en-US"/>
+          </w:rPr>
+          <w:t>https://mintivestudio.com/es</w:t>
+        </w:r>
+      </w:hyperlink>
+    </w:p>
+    <w:p>
+      <w:pPr>
+        <w:ind w:left="709" w:hanging="709"/>
+      </w:pPr>
+      <w:r>
+        <w:rPr>
+          <w:lang w:val="en-US"/>
+        </w:rPr>
+        <w:t xml:space="preserve">Sapkota, R., Roumeliotis, K. I., &amp; Karkee, M. (2025). </w:t>
+      </w:r>
+      <w:r>
+        <w:rPr>
+          <w:lang w:val="en-US"/>
+        </w:rPr>
+        <w:t>Ai agents vs. agentic ai: A conceptual taxonomy, applications and challenges. </w:t>
+      </w:r>
+      <w:r>
+        <w:t>Information Fusion, 103599.</w:t>
+      </w:r>
+    </w:p>
+    <w:p>
+      <w:pPr>
+        <w:ind w:left="709" w:hanging="709"/>
+        <w:rPr>
+          <w:lang w:val="en-US"/>
+        </w:rPr>
+      </w:pPr>
+      <w:r>
+        <w:rPr>
+          <w:lang w:val="en-US"/>
+        </w:rPr>
+        <w:t>Using LLMs to generate terraform code - 2025 update. (</w:t>
+      </w:r>
+      <w:r>
+        <w:rPr>
+          <w:lang w:val="en-US"/>
+        </w:rPr>
+        <w:t xml:space="preserve">28 de </w:t>
+      </w:r>
       <w:proofErr w:type="spellStart"/>
       <w:r>
-        <w:t>agents</w:t>
+        <w:rPr>
+          <w:lang w:val="en-US"/>
+        </w:rPr>
+        <w:t>julio</w:t>
       </w:r>
       <w:proofErr w:type="spellEnd"/>
       <w:r>
-        <w:t xml:space="preserve"> vs. </w:t>
+        <w:rPr>
+          <w:lang w:val="en-US"/>
+        </w:rPr>
+        <w:t xml:space="preserve"> de 2025</w:t>
+      </w:r>
+      <w:r>
+        <w:rPr>
+          <w:lang w:val="en-US"/>
+        </w:rPr>
+        <w:t>).</w:t>
+      </w:r>
+      <w:r>
+        <w:rPr>
+          <w:lang w:val="en-US"/>
+        </w:rPr>
+        <w:t xml:space="preserve"> </w:t>
       </w:r>
       <w:proofErr w:type="spellStart"/>
-      <w:r>
-        <w:t>agentic</w:t>
+      <w:proofErr w:type="gramStart"/>
+      <w:r>
+        <w:rPr>
+          <w:i/>
+          <w:iCs/>
+          <w:lang w:val="en-US"/>
+        </w:rPr>
+        <w:t>Terrateam</w:t>
       </w:r>
       <w:proofErr w:type="spellEnd"/>
-      <w:r>
-        <w:t xml:space="preserve"> </w:t>
-      </w:r>
-      <w:proofErr w:type="spellStart"/>
-      <w:r>
-        <w:t>ai</w:t>
-      </w:r>
-      <w:proofErr w:type="spellEnd"/>
-      <w:r>
-        <w:t xml:space="preserve">: A conceptual </w:t>
-      </w:r>
-      <w:proofErr w:type="spellStart"/>
-      <w:r>
-        <w:t>taxonomy</w:t>
-      </w:r>
-      <w:proofErr w:type="spellEnd"/>
-      <w:r>
-        <w:t xml:space="preserve">, </w:t>
-      </w:r>
-      <w:proofErr w:type="spellStart"/>
-      <w:r>
-        <w:t>applications</w:t>
-      </w:r>
-      <w:proofErr w:type="spellEnd"/>
-      <w:r>
-        <w:t xml:space="preserve"> and </w:t>
-      </w:r>
-      <w:proofErr w:type="spellStart"/>
-      <w:r>
-        <w:t>challenges</w:t>
-      </w:r>
-      <w:proofErr w:type="spellEnd"/>
-      <w:r>
-        <w:t>. </w:t>
-      </w:r>
-      <w:proofErr w:type="spellStart"/>
-      <w:r>
-        <w:t>Information</w:t>
-      </w:r>
-      <w:proofErr w:type="spellEnd"/>
-      <w:r>
-        <w:t xml:space="preserve"> </w:t>
-      </w:r>
-      <w:proofErr w:type="spellStart"/>
-      <w:r>
-        <w:t>Fusion</w:t>
-      </w:r>
-      <w:proofErr w:type="spellEnd"/>
-      <w:r>
-        <w:t>, 103599.</w:t>
-      </w:r>
+      <w:proofErr w:type="gramEnd"/>
+      <w:r>
+        <w:rPr>
+          <w:lang w:val="en-US"/>
+        </w:rPr>
+        <w:t xml:space="preserve">. </w:t>
+      </w:r>
+      <w:hyperlink r:id="rId19" w:tgtFrame="_blank" w:tooltip="https://terrateam.io/blog/using-llms-to-generate-terraform-code?utm_source=chatgpt.com" w:history="1">
+        <w:r>
+          <w:rPr>
+            <w:rStyle w:val="Hipervnculo"/>
+            <w:lang w:val="en-US"/>
+          </w:rPr>
+          <w:t>https://terrateam.io/blog/using-llms-to-generate-terraform-code?utm_source=chatgpt.com</w:t>
+        </w:r>
+      </w:hyperlink>
     </w:p>
     <w:sectPr>
-      <w:headerReference w:type="default" r:id="rId11"/>
+      <w:headerReference w:type="default" r:id="rId20"/>
       <w:pgSz w:w="12242" w:h="15842" w:code="1"/>
       <w:pgMar w:top="1440" w:right="1440" w:bottom="1440" w:left="1440" w:header="709" w:footer="709" w:gutter="0"/>
       <w:cols w:space="708"/>
@@ -3594,6 +4577,304 @@
     </w:lvl>
   </w:abstractNum>
   <w:abstractNum w:abstractNumId="21" w15:restartNumberingAfterBreak="0">
+    <w:nsid w:val="50D41CCB"/>
+    <w:multiLevelType w:val="multilevel"/>
+    <w:tmpl w:val="82A43876"/>
+    <w:lvl w:ilvl="0">
+      <w:start w:val="1"/>
+      <w:numFmt w:val="bullet"/>
+      <w:lvlText w:val=""/>
+      <w:lvlJc w:val="left"/>
+      <w:pPr>
+        <w:tabs>
+          <w:tab w:val="num" w:pos="720"/>
+        </w:tabs>
+        <w:ind w:left="720" w:hanging="360"/>
+      </w:pPr>
+      <w:rPr>
+        <w:rFonts w:ascii="Symbol" w:hAnsi="Symbol" w:hint="default"/>
+        <w:sz w:val="20"/>
+      </w:rPr>
+    </w:lvl>
+    <w:lvl w:ilvl="1" w:tentative="1">
+      <w:start w:val="1"/>
+      <w:numFmt w:val="bullet"/>
+      <w:lvlText w:val="o"/>
+      <w:lvlJc w:val="left"/>
+      <w:pPr>
+        <w:tabs>
+          <w:tab w:val="num" w:pos="1440"/>
+        </w:tabs>
+        <w:ind w:left="1440" w:hanging="360"/>
+      </w:pPr>
+      <w:rPr>
+        <w:rFonts w:ascii="Courier New" w:hAnsi="Courier New" w:hint="default"/>
+        <w:sz w:val="20"/>
+      </w:rPr>
+    </w:lvl>
+    <w:lvl w:ilvl="2" w:tentative="1">
+      <w:start w:val="1"/>
+      <w:numFmt w:val="bullet"/>
+      <w:lvlText w:val=""/>
+      <w:lvlJc w:val="left"/>
+      <w:pPr>
+        <w:tabs>
+          <w:tab w:val="num" w:pos="2160"/>
+        </w:tabs>
+        <w:ind w:left="2160" w:hanging="360"/>
+      </w:pPr>
+      <w:rPr>
+        <w:rFonts w:ascii="Wingdings" w:hAnsi="Wingdings" w:hint="default"/>
+        <w:sz w:val="20"/>
+      </w:rPr>
+    </w:lvl>
+    <w:lvl w:ilvl="3" w:tentative="1">
+      <w:start w:val="1"/>
+      <w:numFmt w:val="bullet"/>
+      <w:lvlText w:val=""/>
+      <w:lvlJc w:val="left"/>
+      <w:pPr>
+        <w:tabs>
+          <w:tab w:val="num" w:pos="2880"/>
+        </w:tabs>
+        <w:ind w:left="2880" w:hanging="360"/>
+      </w:pPr>
+      <w:rPr>
+        <w:rFonts w:ascii="Wingdings" w:hAnsi="Wingdings" w:hint="default"/>
+        <w:sz w:val="20"/>
+      </w:rPr>
+    </w:lvl>
+    <w:lvl w:ilvl="4" w:tentative="1">
+      <w:start w:val="1"/>
+      <w:numFmt w:val="bullet"/>
+      <w:lvlText w:val=""/>
+      <w:lvlJc w:val="left"/>
+      <w:pPr>
+        <w:tabs>
+          <w:tab w:val="num" w:pos="3600"/>
+        </w:tabs>
+        <w:ind w:left="3600" w:hanging="360"/>
+      </w:pPr>
+      <w:rPr>
+        <w:rFonts w:ascii="Wingdings" w:hAnsi="Wingdings" w:hint="default"/>
+        <w:sz w:val="20"/>
+      </w:rPr>
+    </w:lvl>
+    <w:lvl w:ilvl="5" w:tentative="1">
+      <w:start w:val="1"/>
+      <w:numFmt w:val="bullet"/>
+      <w:lvlText w:val=""/>
+      <w:lvlJc w:val="left"/>
+      <w:pPr>
+        <w:tabs>
+          <w:tab w:val="num" w:pos="4320"/>
+        </w:tabs>
+        <w:ind w:left="4320" w:hanging="360"/>
+      </w:pPr>
+      <w:rPr>
+        <w:rFonts w:ascii="Wingdings" w:hAnsi="Wingdings" w:hint="default"/>
+        <w:sz w:val="20"/>
+      </w:rPr>
+    </w:lvl>
+    <w:lvl w:ilvl="6" w:tentative="1">
+      <w:start w:val="1"/>
+      <w:numFmt w:val="bullet"/>
+      <w:lvlText w:val=""/>
+      <w:lvlJc w:val="left"/>
+      <w:pPr>
+        <w:tabs>
+          <w:tab w:val="num" w:pos="5040"/>
+        </w:tabs>
+        <w:ind w:left="5040" w:hanging="360"/>
+      </w:pPr>
+      <w:rPr>
+        <w:rFonts w:ascii="Wingdings" w:hAnsi="Wingdings" w:hint="default"/>
+        <w:sz w:val="20"/>
+      </w:rPr>
+    </w:lvl>
+    <w:lvl w:ilvl="7" w:tentative="1">
+      <w:start w:val="1"/>
+      <w:numFmt w:val="bullet"/>
+      <w:lvlText w:val=""/>
+      <w:lvlJc w:val="left"/>
+      <w:pPr>
+        <w:tabs>
+          <w:tab w:val="num" w:pos="5760"/>
+        </w:tabs>
+        <w:ind w:left="5760" w:hanging="360"/>
+      </w:pPr>
+      <w:rPr>
+        <w:rFonts w:ascii="Wingdings" w:hAnsi="Wingdings" w:hint="default"/>
+        <w:sz w:val="20"/>
+      </w:rPr>
+    </w:lvl>
+    <w:lvl w:ilvl="8" w:tentative="1">
+      <w:start w:val="1"/>
+      <w:numFmt w:val="bullet"/>
+      <w:lvlText w:val=""/>
+      <w:lvlJc w:val="left"/>
+      <w:pPr>
+        <w:tabs>
+          <w:tab w:val="num" w:pos="6480"/>
+        </w:tabs>
+        <w:ind w:left="6480" w:hanging="360"/>
+      </w:pPr>
+      <w:rPr>
+        <w:rFonts w:ascii="Wingdings" w:hAnsi="Wingdings" w:hint="default"/>
+        <w:sz w:val="20"/>
+      </w:rPr>
+    </w:lvl>
+  </w:abstractNum>
+  <w:abstractNum w:abstractNumId="22" w15:restartNumberingAfterBreak="0">
+    <w:nsid w:val="52525EA8"/>
+    <w:multiLevelType w:val="multilevel"/>
+    <w:tmpl w:val="2FA08C3A"/>
+    <w:lvl w:ilvl="0">
+      <w:start w:val="1"/>
+      <w:numFmt w:val="bullet"/>
+      <w:lvlText w:val=""/>
+      <w:lvlJc w:val="left"/>
+      <w:pPr>
+        <w:tabs>
+          <w:tab w:val="num" w:pos="720"/>
+        </w:tabs>
+        <w:ind w:left="720" w:hanging="360"/>
+      </w:pPr>
+      <w:rPr>
+        <w:rFonts w:ascii="Symbol" w:hAnsi="Symbol" w:hint="default"/>
+        <w:sz w:val="20"/>
+      </w:rPr>
+    </w:lvl>
+    <w:lvl w:ilvl="1" w:tentative="1">
+      <w:start w:val="1"/>
+      <w:numFmt w:val="bullet"/>
+      <w:lvlText w:val="o"/>
+      <w:lvlJc w:val="left"/>
+      <w:pPr>
+        <w:tabs>
+          <w:tab w:val="num" w:pos="1440"/>
+        </w:tabs>
+        <w:ind w:left="1440" w:hanging="360"/>
+      </w:pPr>
+      <w:rPr>
+        <w:rFonts w:ascii="Courier New" w:hAnsi="Courier New" w:hint="default"/>
+        <w:sz w:val="20"/>
+      </w:rPr>
+    </w:lvl>
+    <w:lvl w:ilvl="2" w:tentative="1">
+      <w:start w:val="1"/>
+      <w:numFmt w:val="bullet"/>
+      <w:lvlText w:val=""/>
+      <w:lvlJc w:val="left"/>
+      <w:pPr>
+        <w:tabs>
+          <w:tab w:val="num" w:pos="2160"/>
+        </w:tabs>
+        <w:ind w:left="2160" w:hanging="360"/>
+      </w:pPr>
+      <w:rPr>
+        <w:rFonts w:ascii="Wingdings" w:hAnsi="Wingdings" w:hint="default"/>
+        <w:sz w:val="20"/>
+      </w:rPr>
+    </w:lvl>
+    <w:lvl w:ilvl="3" w:tentative="1">
+      <w:start w:val="1"/>
+      <w:numFmt w:val="bullet"/>
+      <w:lvlText w:val=""/>
+      <w:lvlJc w:val="left"/>
+      <w:pPr>
+        <w:tabs>
+          <w:tab w:val="num" w:pos="2880"/>
+        </w:tabs>
+        <w:ind w:left="2880" w:hanging="360"/>
+      </w:pPr>
+      <w:rPr>
+        <w:rFonts w:ascii="Wingdings" w:hAnsi="Wingdings" w:hint="default"/>
+        <w:sz w:val="20"/>
+      </w:rPr>
+    </w:lvl>
+    <w:lvl w:ilvl="4" w:tentative="1">
+      <w:start w:val="1"/>
+      <w:numFmt w:val="bullet"/>
+      <w:lvlText w:val=""/>
+      <w:lvlJc w:val="left"/>
+      <w:pPr>
+        <w:tabs>
+          <w:tab w:val="num" w:pos="3600"/>
+        </w:tabs>
+        <w:ind w:left="3600" w:hanging="360"/>
+      </w:pPr>
+      <w:rPr>
+        <w:rFonts w:ascii="Wingdings" w:hAnsi="Wingdings" w:hint="default"/>
+        <w:sz w:val="20"/>
+      </w:rPr>
+    </w:lvl>
+    <w:lvl w:ilvl="5" w:tentative="1">
+      <w:start w:val="1"/>
+      <w:numFmt w:val="bullet"/>
+      <w:lvlText w:val=""/>
+      <w:lvlJc w:val="left"/>
+      <w:pPr>
+        <w:tabs>
+          <w:tab w:val="num" w:pos="4320"/>
+        </w:tabs>
+        <w:ind w:left="4320" w:hanging="360"/>
+      </w:pPr>
+      <w:rPr>
+        <w:rFonts w:ascii="Wingdings" w:hAnsi="Wingdings" w:hint="default"/>
+        <w:sz w:val="20"/>
+      </w:rPr>
+    </w:lvl>
+    <w:lvl w:ilvl="6" w:tentative="1">
+      <w:start w:val="1"/>
+      <w:numFmt w:val="bullet"/>
+      <w:lvlText w:val=""/>
+      <w:lvlJc w:val="left"/>
+      <w:pPr>
+        <w:tabs>
+          <w:tab w:val="num" w:pos="5040"/>
+        </w:tabs>
+        <w:ind w:left="5040" w:hanging="360"/>
+      </w:pPr>
+      <w:rPr>
+        <w:rFonts w:ascii="Wingdings" w:hAnsi="Wingdings" w:hint="default"/>
+        <w:sz w:val="20"/>
+      </w:rPr>
+    </w:lvl>
+    <w:lvl w:ilvl="7" w:tentative="1">
+      <w:start w:val="1"/>
+      <w:numFmt w:val="bullet"/>
+      <w:lvlText w:val=""/>
+      <w:lvlJc w:val="left"/>
+      <w:pPr>
+        <w:tabs>
+          <w:tab w:val="num" w:pos="5760"/>
+        </w:tabs>
+        <w:ind w:left="5760" w:hanging="360"/>
+      </w:pPr>
+      <w:rPr>
+        <w:rFonts w:ascii="Wingdings" w:hAnsi="Wingdings" w:hint="default"/>
+        <w:sz w:val="20"/>
+      </w:rPr>
+    </w:lvl>
+    <w:lvl w:ilvl="8" w:tentative="1">
+      <w:start w:val="1"/>
+      <w:numFmt w:val="bullet"/>
+      <w:lvlText w:val=""/>
+      <w:lvlJc w:val="left"/>
+      <w:pPr>
+        <w:tabs>
+          <w:tab w:val="num" w:pos="6480"/>
+        </w:tabs>
+        <w:ind w:left="6480" w:hanging="360"/>
+      </w:pPr>
+      <w:rPr>
+        <w:rFonts w:ascii="Wingdings" w:hAnsi="Wingdings" w:hint="default"/>
+        <w:sz w:val="20"/>
+      </w:rPr>
+    </w:lvl>
+  </w:abstractNum>
+  <w:abstractNum w:abstractNumId="23" w15:restartNumberingAfterBreak="0">
     <w:nsid w:val="5285711B"/>
     <w:multiLevelType w:val="multilevel"/>
     <w:tmpl w:val="C85E6270"/>
@@ -3742,7 +5023,7 @@
       </w:rPr>
     </w:lvl>
   </w:abstractNum>
-  <w:abstractNum w:abstractNumId="22" w15:restartNumberingAfterBreak="0">
+  <w:abstractNum w:abstractNumId="24" w15:restartNumberingAfterBreak="0">
     <w:nsid w:val="5E1E663D"/>
     <w:multiLevelType w:val="hybridMultilevel"/>
     <w:tmpl w:val="FCBA23BA"/>
@@ -3855,7 +5136,7 @@
       </w:rPr>
     </w:lvl>
   </w:abstractNum>
-  <w:abstractNum w:abstractNumId="23" w15:restartNumberingAfterBreak="0">
+  <w:abstractNum w:abstractNumId="25" w15:restartNumberingAfterBreak="0">
     <w:nsid w:val="63D06169"/>
     <w:multiLevelType w:val="multilevel"/>
     <w:tmpl w:val="715405CE"/>
@@ -4004,7 +5285,7 @@
       </w:rPr>
     </w:lvl>
   </w:abstractNum>
-  <w:abstractNum w:abstractNumId="24" w15:restartNumberingAfterBreak="0">
+  <w:abstractNum w:abstractNumId="26" w15:restartNumberingAfterBreak="0">
     <w:nsid w:val="66286410"/>
     <w:multiLevelType w:val="multilevel"/>
     <w:tmpl w:val="2B78EC36"/>
@@ -4153,7 +5434,7 @@
       </w:rPr>
     </w:lvl>
   </w:abstractNum>
-  <w:abstractNum w:abstractNumId="25" w15:restartNumberingAfterBreak="0">
+  <w:abstractNum w:abstractNumId="27" w15:restartNumberingAfterBreak="0">
     <w:nsid w:val="68D870A8"/>
     <w:multiLevelType w:val="multilevel"/>
     <w:tmpl w:val="527E0382"/>
@@ -4302,7 +5583,7 @@
       </w:rPr>
     </w:lvl>
   </w:abstractNum>
-  <w:abstractNum w:abstractNumId="26" w15:restartNumberingAfterBreak="0">
+  <w:abstractNum w:abstractNumId="28" w15:restartNumberingAfterBreak="0">
     <w:nsid w:val="73956129"/>
     <w:multiLevelType w:val="multilevel"/>
     <w:tmpl w:val="75385BB4"/>
@@ -4451,7 +5732,7 @@
       </w:rPr>
     </w:lvl>
   </w:abstractNum>
-  <w:abstractNum w:abstractNumId="27" w15:restartNumberingAfterBreak="0">
+  <w:abstractNum w:abstractNumId="29" w15:restartNumberingAfterBreak="0">
     <w:nsid w:val="751D3D43"/>
     <w:multiLevelType w:val="multilevel"/>
     <w:tmpl w:val="E94A3EA2"/>
@@ -4600,7 +5881,7 @@
       </w:rPr>
     </w:lvl>
   </w:abstractNum>
-  <w:abstractNum w:abstractNumId="28" w15:restartNumberingAfterBreak="0">
+  <w:abstractNum w:abstractNumId="30" w15:restartNumberingAfterBreak="0">
     <w:nsid w:val="77A42150"/>
     <w:multiLevelType w:val="hybridMultilevel"/>
     <w:tmpl w:val="7744CD4A"/>
@@ -4713,7 +5994,7 @@
       </w:rPr>
     </w:lvl>
   </w:abstractNum>
-  <w:abstractNum w:abstractNumId="29" w15:restartNumberingAfterBreak="0">
+  <w:abstractNum w:abstractNumId="31" w15:restartNumberingAfterBreak="0">
     <w:nsid w:val="7C521E92"/>
     <w:multiLevelType w:val="hybridMultilevel"/>
     <w:tmpl w:val="DECA8DDA"/>
@@ -4833,7 +6114,7 @@
     <w:abstractNumId w:val="15"/>
   </w:num>
   <w:num w:numId="3" w16cid:durableId="913705407">
-    <w:abstractNumId w:val="26"/>
+    <w:abstractNumId w:val="28"/>
   </w:num>
   <w:num w:numId="4" w16cid:durableId="29380983">
     <w:abstractNumId w:val="4"/>
@@ -4845,7 +6126,7 @@
     <w:abstractNumId w:val="0"/>
   </w:num>
   <w:num w:numId="7" w16cid:durableId="1585215263">
-    <w:abstractNumId w:val="21"/>
+    <w:abstractNumId w:val="23"/>
   </w:num>
   <w:num w:numId="8" w16cid:durableId="990208855">
     <w:abstractNumId w:val="13"/>
@@ -4863,7 +6144,7 @@
     <w:abstractNumId w:val="1"/>
   </w:num>
   <w:num w:numId="13" w16cid:durableId="895353962">
-    <w:abstractNumId w:val="24"/>
+    <w:abstractNumId w:val="26"/>
   </w:num>
   <w:num w:numId="14" w16cid:durableId="278876725">
     <w:abstractNumId w:val="11"/>
@@ -4875,10 +6156,10 @@
     <w:abstractNumId w:val="19"/>
   </w:num>
   <w:num w:numId="17" w16cid:durableId="88015063">
-    <w:abstractNumId w:val="23"/>
+    <w:abstractNumId w:val="25"/>
   </w:num>
   <w:num w:numId="18" w16cid:durableId="1747845671">
-    <w:abstractNumId w:val="25"/>
+    <w:abstractNumId w:val="27"/>
   </w:num>
   <w:num w:numId="19" w16cid:durableId="99683666">
     <w:abstractNumId w:val="18"/>
@@ -4887,7 +6168,7 @@
     <w:abstractNumId w:val="16"/>
   </w:num>
   <w:num w:numId="21" w16cid:durableId="646740519">
-    <w:abstractNumId w:val="27"/>
+    <w:abstractNumId w:val="29"/>
   </w:num>
   <w:num w:numId="22" w16cid:durableId="668218501">
     <w:abstractNumId w:val="6"/>
@@ -4896,10 +6177,10 @@
     <w:abstractNumId w:val="9"/>
   </w:num>
   <w:num w:numId="24" w16cid:durableId="324094632">
-    <w:abstractNumId w:val="22"/>
+    <w:abstractNumId w:val="24"/>
   </w:num>
   <w:num w:numId="25" w16cid:durableId="138495263">
-    <w:abstractNumId w:val="29"/>
+    <w:abstractNumId w:val="31"/>
   </w:num>
   <w:num w:numId="26" w16cid:durableId="458108060">
     <w:abstractNumId w:val="2"/>
@@ -4911,10 +6192,16 @@
     <w:abstractNumId w:val="10"/>
   </w:num>
   <w:num w:numId="29" w16cid:durableId="1434125775">
-    <w:abstractNumId w:val="28"/>
+    <w:abstractNumId w:val="30"/>
   </w:num>
   <w:num w:numId="30" w16cid:durableId="143161839">
     <w:abstractNumId w:val="5"/>
+  </w:num>
+  <w:num w:numId="31" w16cid:durableId="398864228">
+    <w:abstractNumId w:val="22"/>
+  </w:num>
+  <w:num w:numId="32" w16cid:durableId="945769544">
+    <w:abstractNumId w:val="21"/>
   </w:num>
 </w:numbering>
 </file>
@@ -5534,7 +6821,6 @@
   <w:style w:type="character" w:default="1" w:styleId="Fuentedeprrafopredeter">
     <w:name w:val="Default Paragraph Font"/>
     <w:uiPriority w:val="1"/>
-    <w:semiHidden/>
     <w:unhideWhenUsed/>
   </w:style>
   <w:style w:type="table" w:default="1" w:styleId="Tablanormal">
@@ -6122,6 +7408,30 @@
       <w:ind w:left="480"/>
     </w:pPr>
   </w:style>
+  <w:style w:type="character" w:styleId="Hipervnculovisitado">
+    <w:name w:val="FollowedHyperlink"/>
+    <w:basedOn w:val="Fuentedeprrafopredeter"/>
+    <w:uiPriority w:val="99"/>
+    <w:semiHidden/>
+    <w:unhideWhenUsed/>
+    <w:rsid w:val="00244312"/>
+    <w:rPr>
+      <w:color w:val="96607D" w:themeColor="followedHyperlink"/>
+      <w:u w:val="single"/>
+    </w:rPr>
+  </w:style>
+  <w:style w:type="character" w:styleId="Mencinsinresolver">
+    <w:name w:val="Unresolved Mention"/>
+    <w:basedOn w:val="Fuentedeprrafopredeter"/>
+    <w:uiPriority w:val="99"/>
+    <w:semiHidden/>
+    <w:unhideWhenUsed/>
+    <w:rsid w:val="003936BD"/>
+    <w:rPr>
+      <w:color w:val="605E5C"/>
+      <w:shd w:val="clear" w:color="auto" w:fill="E1DFDD"/>
+    </w:rPr>
+  </w:style>
 </w:styles>
 </file>
 
@@ -6421,17 +7731,6 @@
 </file>
 
 <file path=customXml/item1.xml><?xml version="1.0" encoding="utf-8"?>
-<p:properties xmlns:p="http://schemas.microsoft.com/office/2006/metadata/properties" xmlns:xsi="http://www.w3.org/2001/XMLSchema-instance" xmlns:pc="http://schemas.microsoft.com/office/infopath/2007/PartnerControls">
-  <documentManagement>
-    <lcf76f155ced4ddcb4097134ff3c332f xmlns="726918c5-b813-45ce-a7f4-072932c2b8bb">
-      <Terms xmlns="http://schemas.microsoft.com/office/infopath/2007/PartnerControls"/>
-    </lcf76f155ced4ddcb4097134ff3c332f>
-    <TaxCatchAll xmlns="e62964a9-b690-45b9-9af1-9bde9b4d2ac6" xsi:nil="true"/>
-  </documentManagement>
-</p:properties>
-</file>
-
-<file path=customXml/item2.xml><?xml version="1.0" encoding="utf-8"?>
 <?mso-contentType ?>
 <FormTemplates xmlns="http://schemas.microsoft.com/sharepoint/v3/contenttype/forms">
   <Display>DocumentLibraryForm</Display>
@@ -6440,7 +7739,7 @@
 </FormTemplates>
 </file>
 
-<file path=customXml/item3.xml><?xml version="1.0" encoding="utf-8"?>
+<file path=customXml/item2.xml><?xml version="1.0" encoding="utf-8"?>
 <ct:contentTypeSchema xmlns:ct="http://schemas.microsoft.com/office/2006/metadata/contentType" xmlns:ma="http://schemas.microsoft.com/office/2006/metadata/properties/metaAttributes" ct:_="" ma:_="" ma:contentTypeName="Documento" ma:contentTypeID="0x010100615F761A4F05D74C9A09B8B9178C8F28" ma:contentTypeVersion="11" ma:contentTypeDescription="Crear nuevo documento." ma:contentTypeScope="" ma:versionID="f2f25e755a799aa011955b0addb95bd3">
   <xsd:schema xmlns:xsd="http://www.w3.org/2001/XMLSchema" xmlns:xs="http://www.w3.org/2001/XMLSchema" xmlns:p="http://schemas.microsoft.com/office/2006/metadata/properties" xmlns:ns2="726918c5-b813-45ce-a7f4-072932c2b8bb" xmlns:ns3="e62964a9-b690-45b9-9af1-9bde9b4d2ac6" targetNamespace="http://schemas.microsoft.com/office/2006/metadata/properties" ma:root="true" ma:fieldsID="2464f854b7c22d8db5f843be444648f4" ns2:_="" ns3:_="">
     <xsd:import namespace="726918c5-b813-45ce-a7f4-072932c2b8bb"/>
@@ -6635,22 +7934,22 @@
 </ct:contentTypeSchema>
 </file>
 
-<file path=customXml/item4.xml><?xml version="1.0" encoding="utf-8"?>
+<file path=customXml/item3.xml><?xml version="1.0" encoding="utf-8"?>
 <b:Sources xmlns:b="http://schemas.openxmlformats.org/officeDocument/2006/bibliography" xmlns="http://schemas.openxmlformats.org/officeDocument/2006/bibliography" SelectedStyle="\APASixthEditionOfficeOnline.xsl" StyleName="APA" Version="6"/>
 </file>
 
-<file path=customXml/itemProps1.xml><?xml version="1.0" encoding="utf-8"?>
-<ds:datastoreItem xmlns:ds="http://schemas.openxmlformats.org/officeDocument/2006/customXml" ds:itemID="{15D5A60D-4217-4AC3-99D1-52AEB5FA670D}">
-  <ds:schemaRefs>
-    <ds:schemaRef ds:uri="http://schemas.microsoft.com/office/2006/metadata/properties"/>
-    <ds:schemaRef ds:uri="http://schemas.microsoft.com/office/infopath/2007/PartnerControls"/>
-    <ds:schemaRef ds:uri="726918c5-b813-45ce-a7f4-072932c2b8bb"/>
-    <ds:schemaRef ds:uri="e62964a9-b690-45b9-9af1-9bde9b4d2ac6"/>
-  </ds:schemaRefs>
-</ds:datastoreItem>
+<file path=customXml/item4.xml><?xml version="1.0" encoding="utf-8"?>
+<p:properties xmlns:p="http://schemas.microsoft.com/office/2006/metadata/properties" xmlns:xsi="http://www.w3.org/2001/XMLSchema-instance" xmlns:pc="http://schemas.microsoft.com/office/infopath/2007/PartnerControls">
+  <documentManagement>
+    <lcf76f155ced4ddcb4097134ff3c332f xmlns="726918c5-b813-45ce-a7f4-072932c2b8bb">
+      <Terms xmlns="http://schemas.microsoft.com/office/infopath/2007/PartnerControls"/>
+    </lcf76f155ced4ddcb4097134ff3c332f>
+    <TaxCatchAll xmlns="e62964a9-b690-45b9-9af1-9bde9b4d2ac6" xsi:nil="true"/>
+  </documentManagement>
+</p:properties>
 </file>
 
-<file path=customXml/itemProps2.xml><?xml version="1.0" encoding="utf-8"?>
+<file path=customXml/itemProps1.xml><?xml version="1.0" encoding="utf-8"?>
 <ds:datastoreItem xmlns:ds="http://schemas.openxmlformats.org/officeDocument/2006/customXml" ds:itemID="{EAA2F7B7-FDE4-4F0B-A496-BB3AFBC7C086}">
   <ds:schemaRefs>
     <ds:schemaRef ds:uri="http://schemas.microsoft.com/sharepoint/v3/contenttype/forms"/>
@@ -6658,7 +7957,7 @@
 </ds:datastoreItem>
 </file>
 
-<file path=customXml/itemProps3.xml><?xml version="1.0" encoding="utf-8"?>
+<file path=customXml/itemProps2.xml><?xml version="1.0" encoding="utf-8"?>
 <ds:datastoreItem xmlns:ds="http://schemas.openxmlformats.org/officeDocument/2006/customXml" ds:itemID="{117658F5-249E-4D20-9663-AD2ADA44953E}">
   <ds:schemaRefs>
     <ds:schemaRef ds:uri="http://schemas.microsoft.com/office/2006/metadata/contentType"/>
@@ -6677,10 +7976,21 @@
 </ds:datastoreItem>
 </file>
 
-<file path=customXml/itemProps4.xml><?xml version="1.0" encoding="utf-8"?>
+<file path=customXml/itemProps3.xml><?xml version="1.0" encoding="utf-8"?>
 <ds:datastoreItem xmlns:ds="http://schemas.openxmlformats.org/officeDocument/2006/customXml" ds:itemID="{DF4C988B-7F1A-4DC3-A8D4-68B34AF3D94A}">
   <ds:schemaRefs>
     <ds:schemaRef ds:uri="http://schemas.openxmlformats.org/officeDocument/2006/bibliography"/>
   </ds:schemaRefs>
 </ds:datastoreItem>
+</file>
+
+<file path=customXml/itemProps4.xml><?xml version="1.0" encoding="utf-8"?>
+<ds:datastoreItem xmlns:ds="http://schemas.openxmlformats.org/officeDocument/2006/customXml" ds:itemID="{15D5A60D-4217-4AC3-99D1-52AEB5FA670D}">
+  <ds:schemaRefs>
+    <ds:schemaRef ds:uri="http://schemas.microsoft.com/office/2006/metadata/properties"/>
+    <ds:schemaRef ds:uri="http://schemas.microsoft.com/office/infopath/2007/PartnerControls"/>
+    <ds:schemaRef ds:uri="726918c5-b813-45ce-a7f4-072932c2b8bb"/>
+    <ds:schemaRef ds:uri="e62964a9-b690-45b9-9af1-9bde9b4d2ac6"/>
+  </ds:schemaRefs>
+</ds:datastoreItem>
 </file>
</xml_diff>